<commit_message>
docs: explain companion game design and proposed agent extension
</commit_message>
<xml_diff>
--- a/NarraCare_Final_Report_Revised.docx
+++ b/NarraCare_Final_Report_Revised.docx
@@ -137,7 +137,7 @@
           <w:color w:val="000000"/>
           <w:sz w:val="22"/>
         </w:rPr>
-        <w:t>Our contribution is a task-specific architecture and evaluation workflow for making rehabilitation recommendations inspectable end to end. First, five components connect patient-state simulation to recommendation, runtime filtering, template-based explanation and reward feedback. Hard task restrictions occupy a separate stage from the Beta safety bonus and soft reward penalties. Second, ungated top-5 IER complements accepted-task SVR, separating proposal feasibility from execution feasibility. Third, source-linked rule definitions, interaction logs, per-rule post-hoc summaries and committed artifacts support repeatable implementation review. These provide a reference implementation that future work can adapt to a specified catalogue and safety policy. The reusable contribution is their rehabilitation-specific composition and evaluation protocol. In the current cohort SAPS records reward 42.02 versus LinUCB 41.94, without a significant paired advantage. The resulting system offers a concrete starting point for reviewing rehabilitation recommendation designs.</w:t>
+        <w:t>Our contribution is a rehabilitation-specific composition of recommendation, safety, narrative support and feedback, with an inspectable evaluation workflow. Five components separate hard task restrictions from the Beta safety bonus and soft reward penalties. Ungated top-5 IER complements accepted-task SVR, distinguishing proposal feasibility from execution feasibility; source-linked rules, logs and committed artifacts support repeatable review. These are contributions in problem formulation, architecture, method integration and evaluation, rather than a claim to have invented IER or a superior bandit. Application design adds a companion-led trail: staged progress, optional rest and narrative acknowledgment make the workflow tangible for design review. In the current cohort SAPS records reward 42.02 versus LinUCB 41.94, without a significant paired advantage. The reusable result is a reference implementation and evaluation protocol; the interface's intended engagement benefits remain untested.</w:t>
       </w:r>
     </w:p>
     <w:p>
@@ -423,7 +423,7 @@
           <w:color w:val="000000"/>
           <w:sz w:val="22"/>
         </w:rPr>
-        <w:t>The five components operate within one pipeline. Each day, the User Simulator emits state and the understanding/memory layer builds context. Safety pre_filter and an emotional difficulty cap restrict candidates before the Recommender ranks them. Safety post_check then reviews the shortlist. The template Narrator renders a proposed task, the simulator chooses and produces feedback, and the Reward Composer computes the scalar reward used in online updates. The Narrator adds a daily closing after the interaction. Thus safety runs both before and after ranking. The Reward Composer is implemented in the simulator's compute_reward function and invoked by pipeline orchestration, rather than an independently deployed service.</w:t>
+        <w:t>NarraCare is evaluated as a context-aware sequential recommender with modular agent-named components. It filters a catalogue, ranks candidates using contextual models, maintains profile/history information, renders template recommendations and updates from simulated feedback. The formal runs and CLI consume structured state; the HTML replays recorded trajectories. A legacy free-text interactive path exists, but conversational clarification and autonomous tool planning are not validated by these results. Each day, the User Simulator supplies state to the understanding/memory layer; Safety pre_filter and an emotional difficulty cap restrict candidates; the Recommender ranks them; and Safety post_check reviews the shortlist. The Narrator frames a task, the simulator chooses and returns feedback, and compute_reward in the simulator supplies the Reward Composer's scalar for online updates. A narrator closing follows. Safety therefore acts before and after ranking, and the Reward Composer is a pipeline function rather than a deployed service.</w:t>
       </w:r>
     </w:p>
     <w:p>
@@ -4840,10 +4840,13 @@
           <w:color w:val="000000"/>
           <w:sz w:val="22"/>
         </w:rPr>
-        <w:t>The demo serves as an offline design-review and communication prototype. A rehabilitation-technology team, researcher or assessor can inspect how a synthetic day's symptoms lead to filtering, a task proposal, narrator wording, simulated response and reward. The HTML trail turns that sequence into a patient-journey walkthrough for discussing understandable guidance and responses to soreness, fatigue or skipping. Its reply buttons alter presentation only; they do not personalize treatment or recompute the recorded outcome. The CLI executes the backend and provides reproducible evidence behind the visual replay. For a patient-facing extension, approved exercises, validated constraints, actual patient-state input and clinical/user evaluation would be required.</w:t>
+        <w:t>The demonstration combines an executable backend with an offline companion-trail walkthrough. Its application-design contribution translates rehabilitation into a light adventure with visible milestones and permission to rest. Patient and companion Pip travel through Misty Forest (days 1–15), Rocky Canyon (16–40) and Snowy Summit (41–60). The authored arcs express Protection &amp; Trust, Plateau &amp; Negotiation, and Autonomy &amp; Farewell. Pip scouts ahead, walks beside the patient, then steps back as autonomy grows; displayed pain, fatigue and mood change the visual response. The intended experience is small, manageable achievements and companionship rather than pressure from a demanding coach. The backend still uses doctor, coach and companion voices; Pip's visual role does not replace those recorded tones.</w:t>
         <w:br/>
         <w:br/>
-        <w:t>The README contains Run the demonstration. Install with python -m pip install -r requirements.txt, then run python -m narracare.demo --user U001 --days 60 --policy saps --seed 42. From the archive, tar xzf narracare_submission.tar.gz and cd narracare_final. Daily tags expose state, filtering counts, proposal score, post-check result, original narrator text/tone, simulated choice, reward and closing. The summary reports reward, five-rule SVR, ungated IER and actual act progression. No API key or network is needed after installation. Use --inspect for source/config/data definitions. Use --user U001 --days 7 --compare saps,linucb,neuralucb for live traces followed by a separately labelled stored 20-persona/60-day table; missing fields remain N/A. Open demo/index.html for nine offline recorded trajectories across three users and three policies. Regeneration uses reproduce_all.sh and reproduce_coldstart.sh; inspect comparison summaries, not exit codes alone.</w:t>
+        <w:t>Try advances a map node; tired/skip replies set up camp without advancing it. Badges and acknowledgment frame rest as part of the journey. These are presentation choices, not additional exercise prescriptions or adaptive treatment: replies never change the recorded recommendation, action or reward. Reduced fatigue, stronger adherence and a felt sense of companionship are design hypotheses requiring user evaluation. Safety counts, task details, narrator tone and component activity remain visible, allowing researchers and rehabilitation-technology teams to discuss both patient experience and system behavior. The presentation stages do not repair the backend arc limitations in Section 6.3.</w:t>
+        <w:br/>
+        <w:br/>
+        <w:t>The README contains Run the demonstration. Install with python -m pip install -r requirements.txt, then run python -m narracare.demo --user U001 --days 60 --policy saps --seed 42. From the archive, tar xzf narracare_submission.tar.gz and cd narracare_final. Daily tags expose state, filtering counts, proposal score, post-check result, original narrator text/tone, simulated choice, reward and closing. The summary reports reward, five-rule SVR, ungated IER and actual act progression. No API key or network is needed after installation. Use --inspect for source/config/data definitions. Use --user U001 --days 7 --compare saps,linucb,neuralucb for live traces followed by a separately labelled stored 20-persona/60-day table; missing fields remain N/A. Open demo/index.html for nine offline recorded trajectories across three users and three policies, with no backend installation. Regeneration uses reproduce_all.sh and reproduce_coldstart.sh; inspect comparison summaries, not exit codes alone.</w:t>
       </w:r>
     </w:p>
     <w:p>
@@ -8294,7 +8297,7 @@
           <w:color w:val="000000"/>
           <w:sz w:val="22"/>
         </w:rPr>
-        <w:t>NarraCare provides a reference implementation and evaluation workflow for inspecting safety-aware rehabilitation recommendations from patient context to feedback. Its practical value is to help research and engineering teams separate task restrictions from learned preferences, distinguish infeasible proposals from accepted-task violations, and review how recommendations become understandable guidance. The offline demo makes this workflow accessible for design review without backend installation; the CLI supplies runtime evidence. These patterns and diagnostics can inform related systems after adapting their catalogues, constraints and evaluation. In the current synthetic cohort SAPS records reward 42.02 versus LinUCB 41.94, without a significant paired advantage, and ungated IER 0.0223 versus 0.0233. The evidence supports the implemented workflow and runtime filtering, while leaving clinical benefit and broader algorithmic superiority unestablished.</w:t>
+        <w:t>NarraCare offers research and engineering teams a reference implementation for separating task restrictions from learned preferences, inspecting proposal and execution safety, and presenting recommendations as understandable guidance. The CLI supplies runtime evidence; the companion-trail replay makes the workflow accessible for design review and explores low-pressure achievement and supportive companionship. These contributions concern architecture, integration, evaluation and application design. In the current synthetic cohort SAPS records reward 42.02 versus LinUCB 41.94, without a significant paired advantage, and ungated IER 0.0223 versus 0.0233. The evidence supports the implemented workflow and runtime filtering; clinical benefit, engagement gains and broader algorithmic superiority remain unestablished.</w:t>
       </w:r>
     </w:p>
     <w:p>
@@ -8324,7 +8327,7 @@
           <w:color w:val="000000"/>
           <w:sz w:val="22"/>
         </w:rPr>
-        <w:t>Next steps are independent repeated rollouts, stronger task-aware baselines, Beta/penalty ablations and fully frozen transfer evaluation. Narrator condition/day mapping and simulator completion bookkeeping also require separately versioned corrections. Clinician review and appropriate patient evaluation would be necessary before patient-care use. The current release incorporates the audited IER/SVR repair and regenerates affected outputs while preserving the synthetic inputs and authored templates.</w:t>
+        <w:t>The current presentation demonstrates the evaluated sequential pipeline and recorded companion interface. A bounded conversational recommender is proposed as a separate follow-up, not an implemented result. A three-day development sprint could first add dialogue state and clarification of missing or conflicting symptoms, then connect explicit recommendation/safety tools and preference memory, and finally test multi-turn behavior. The scope would remain narrow: collect a confirmed state, call the existing filter/ranker, provide task- and rule-grounded explanations, and adapt to feedback without bypassing Safety. Template narration can remain offline; an LLM is not required for this prototype. Scripted tests should cover soreness, fatigue, skipping, preference changes and unsafe requests, checking traceable tool calls, appropriate recommendation changes and preserved constraints. Completion depends on validation, and any agent claim would require new interaction evidence. Longer-term work remains independent repeated rollouts, stronger task-aware baselines, Beta/penalty ablations and fully frozen transfer evaluation, alongside separately versioned corrections to narrator condition/day mapping and simulator completion bookkeeping. Clinician review and patient/user evaluation are prerequisites for care use. The current release retains the audited IER/SVR repair and regenerated outputs with synthetic inputs and authored templates unchanged.</w:t>
       </w:r>
     </w:p>
     <w:p>

</xml_diff>